<commit_message>
docs: update report with demo video link
</commit_message>
<xml_diff>
--- a/reports/MLOps_Assigment_Report_EshwarPradeepK.docx
+++ b/reports/MLOps_Assigment_Report_EshwarPradeepK.docx
@@ -80,7 +80,7 @@
           <w:r>
             <w:fldChar w:fldCharType="separate"/>
           </w:r>
-          <w:hyperlink w:anchor="_Toc229234222" w:history="1">
+          <w:hyperlink w:anchor="_Toc229336882" w:history="1">
             <w:r>
               <w:rPr>
                 <w:rStyle w:val="Hyperlink"/>
@@ -107,7 +107,7 @@
                 <w:noProof/>
                 <w:webHidden/>
               </w:rPr>
-              <w:instrText xml:space="preserve"> PAGEREF _Toc229234222 \h </w:instrText>
+              <w:instrText xml:space="preserve"> PAGEREF _Toc229336882 \h </w:instrText>
             </w:r>
             <w:r>
               <w:rPr>
@@ -152,7 +152,7 @@
               <w14:ligatures w14:val="standardContextual"/>
             </w:rPr>
           </w:pPr>
-          <w:hyperlink w:anchor="_Toc229234223" w:history="1">
+          <w:hyperlink w:anchor="_Toc229336883" w:history="1">
             <w:r>
               <w:rPr>
                 <w:rStyle w:val="Hyperlink"/>
@@ -179,7 +179,7 @@
                 <w:noProof/>
                 <w:webHidden/>
               </w:rPr>
-              <w:instrText xml:space="preserve"> PAGEREF _Toc229234223 \h </w:instrText>
+              <w:instrText xml:space="preserve"> PAGEREF _Toc229336883 \h </w:instrText>
             </w:r>
             <w:r>
               <w:rPr>
@@ -224,7 +224,7 @@
               <w14:ligatures w14:val="standardContextual"/>
             </w:rPr>
           </w:pPr>
-          <w:hyperlink w:anchor="_Toc229234224" w:history="1">
+          <w:hyperlink w:anchor="_Toc229336884" w:history="1">
             <w:r>
               <w:rPr>
                 <w:rStyle w:val="Hyperlink"/>
@@ -251,7 +251,7 @@
                 <w:noProof/>
                 <w:webHidden/>
               </w:rPr>
-              <w:instrText xml:space="preserve"> PAGEREF _Toc229234224 \h </w:instrText>
+              <w:instrText xml:space="preserve"> PAGEREF _Toc229336884 \h </w:instrText>
             </w:r>
             <w:r>
               <w:rPr>
@@ -296,7 +296,7 @@
               <w14:ligatures w14:val="standardContextual"/>
             </w:rPr>
           </w:pPr>
-          <w:hyperlink w:anchor="_Toc229234225" w:history="1">
+          <w:hyperlink w:anchor="_Toc229336885" w:history="1">
             <w:r>
               <w:rPr>
                 <w:rStyle w:val="Hyperlink"/>
@@ -323,7 +323,7 @@
                 <w:noProof/>
                 <w:webHidden/>
               </w:rPr>
-              <w:instrText xml:space="preserve"> PAGEREF _Toc229234225 \h </w:instrText>
+              <w:instrText xml:space="preserve"> PAGEREF _Toc229336885 \h </w:instrText>
             </w:r>
             <w:r>
               <w:rPr>
@@ -368,7 +368,7 @@
               <w14:ligatures w14:val="standardContextual"/>
             </w:rPr>
           </w:pPr>
-          <w:hyperlink w:anchor="_Toc229234226" w:history="1">
+          <w:hyperlink w:anchor="_Toc229336886" w:history="1">
             <w:r>
               <w:rPr>
                 <w:rStyle w:val="Hyperlink"/>
@@ -395,7 +395,7 @@
                 <w:noProof/>
                 <w:webHidden/>
               </w:rPr>
-              <w:instrText xml:space="preserve"> PAGEREF _Toc229234226 \h </w:instrText>
+              <w:instrText xml:space="preserve"> PAGEREF _Toc229336886 \h </w:instrText>
             </w:r>
             <w:r>
               <w:rPr>
@@ -440,7 +440,7 @@
               <w14:ligatures w14:val="standardContextual"/>
             </w:rPr>
           </w:pPr>
-          <w:hyperlink w:anchor="_Toc229234227" w:history="1">
+          <w:hyperlink w:anchor="_Toc229336887" w:history="1">
             <w:r>
               <w:rPr>
                 <w:rStyle w:val="Hyperlink"/>
@@ -467,7 +467,7 @@
                 <w:noProof/>
                 <w:webHidden/>
               </w:rPr>
-              <w:instrText xml:space="preserve"> PAGEREF _Toc229234227 \h </w:instrText>
+              <w:instrText xml:space="preserve"> PAGEREF _Toc229336887 \h </w:instrText>
             </w:r>
             <w:r>
               <w:rPr>
@@ -512,7 +512,7 @@
               <w14:ligatures w14:val="standardContextual"/>
             </w:rPr>
           </w:pPr>
-          <w:hyperlink w:anchor="_Toc229234228" w:history="1">
+          <w:hyperlink w:anchor="_Toc229336888" w:history="1">
             <w:r>
               <w:rPr>
                 <w:rStyle w:val="Hyperlink"/>
@@ -539,7 +539,7 @@
                 <w:noProof/>
                 <w:webHidden/>
               </w:rPr>
-              <w:instrText xml:space="preserve"> PAGEREF _Toc229234228 \h </w:instrText>
+              <w:instrText xml:space="preserve"> PAGEREF _Toc229336888 \h </w:instrText>
             </w:r>
             <w:r>
               <w:rPr>
@@ -584,7 +584,7 @@
               <w14:ligatures w14:val="standardContextual"/>
             </w:rPr>
           </w:pPr>
-          <w:hyperlink w:anchor="_Toc229234229" w:history="1">
+          <w:hyperlink w:anchor="_Toc229336889" w:history="1">
             <w:r>
               <w:rPr>
                 <w:rStyle w:val="Hyperlink"/>
@@ -611,7 +611,7 @@
                 <w:noProof/>
                 <w:webHidden/>
               </w:rPr>
-              <w:instrText xml:space="preserve"> PAGEREF _Toc229234229 \h </w:instrText>
+              <w:instrText xml:space="preserve"> PAGEREF _Toc229336889 \h </w:instrText>
             </w:r>
             <w:r>
               <w:rPr>
@@ -656,7 +656,7 @@
               <w14:ligatures w14:val="standardContextual"/>
             </w:rPr>
           </w:pPr>
-          <w:hyperlink w:anchor="_Toc229234230" w:history="1">
+          <w:hyperlink w:anchor="_Toc229336890" w:history="1">
             <w:r>
               <w:rPr>
                 <w:rStyle w:val="Hyperlink"/>
@@ -683,7 +683,7 @@
                 <w:noProof/>
                 <w:webHidden/>
               </w:rPr>
-              <w:instrText xml:space="preserve"> PAGEREF _Toc229234230 \h </w:instrText>
+              <w:instrText xml:space="preserve"> PAGEREF _Toc229336890 \h </w:instrText>
             </w:r>
             <w:r>
               <w:rPr>
@@ -728,7 +728,7 @@
               <w14:ligatures w14:val="standardContextual"/>
             </w:rPr>
           </w:pPr>
-          <w:hyperlink w:anchor="_Toc229234231" w:history="1">
+          <w:hyperlink w:anchor="_Toc229336891" w:history="1">
             <w:r>
               <w:rPr>
                 <w:rStyle w:val="Hyperlink"/>
@@ -755,7 +755,7 @@
                 <w:noProof/>
                 <w:webHidden/>
               </w:rPr>
-              <w:instrText xml:space="preserve"> PAGEREF _Toc229234231 \h </w:instrText>
+              <w:instrText xml:space="preserve"> PAGEREF _Toc229336891 \h </w:instrText>
             </w:r>
             <w:r>
               <w:rPr>
@@ -800,7 +800,7 @@
               <w14:ligatures w14:val="standardContextual"/>
             </w:rPr>
           </w:pPr>
-          <w:hyperlink w:anchor="_Toc229234232" w:history="1">
+          <w:hyperlink w:anchor="_Toc229336892" w:history="1">
             <w:r>
               <w:rPr>
                 <w:rStyle w:val="Hyperlink"/>
@@ -827,7 +827,7 @@
                 <w:noProof/>
                 <w:webHidden/>
               </w:rPr>
-              <w:instrText xml:space="preserve"> PAGEREF _Toc229234232 \h </w:instrText>
+              <w:instrText xml:space="preserve"> PAGEREF _Toc229336892 \h </w:instrText>
             </w:r>
             <w:r>
               <w:rPr>
@@ -872,7 +872,7 @@
               <w14:ligatures w14:val="standardContextual"/>
             </w:rPr>
           </w:pPr>
-          <w:hyperlink w:anchor="_Toc229234233" w:history="1">
+          <w:hyperlink w:anchor="_Toc229336893" w:history="1">
             <w:r>
               <w:rPr>
                 <w:rStyle w:val="Hyperlink"/>
@@ -899,7 +899,7 @@
                 <w:noProof/>
                 <w:webHidden/>
               </w:rPr>
-              <w:instrText xml:space="preserve"> PAGEREF _Toc229234233 \h </w:instrText>
+              <w:instrText xml:space="preserve"> PAGEREF _Toc229336893 \h </w:instrText>
             </w:r>
             <w:r>
               <w:rPr>
@@ -944,7 +944,7 @@
               <w14:ligatures w14:val="standardContextual"/>
             </w:rPr>
           </w:pPr>
-          <w:hyperlink w:anchor="_Toc229234234" w:history="1">
+          <w:hyperlink w:anchor="_Toc229336894" w:history="1">
             <w:r>
               <w:rPr>
                 <w:rStyle w:val="Hyperlink"/>
@@ -971,7 +971,7 @@
                 <w:noProof/>
                 <w:webHidden/>
               </w:rPr>
-              <w:instrText xml:space="preserve"> PAGEREF _Toc229234234 \h </w:instrText>
+              <w:instrText xml:space="preserve"> PAGEREF _Toc229336894 \h </w:instrText>
             </w:r>
             <w:r>
               <w:rPr>
@@ -1016,7 +1016,7 @@
               <w14:ligatures w14:val="standardContextual"/>
             </w:rPr>
           </w:pPr>
-          <w:hyperlink w:anchor="_Toc229234235" w:history="1">
+          <w:hyperlink w:anchor="_Toc229336895" w:history="1">
             <w:r>
               <w:rPr>
                 <w:rStyle w:val="Hyperlink"/>
@@ -1043,7 +1043,7 @@
                 <w:noProof/>
                 <w:webHidden/>
               </w:rPr>
-              <w:instrText xml:space="preserve"> PAGEREF _Toc229234235 \h </w:instrText>
+              <w:instrText xml:space="preserve"> PAGEREF _Toc229336895 \h </w:instrText>
             </w:r>
             <w:r>
               <w:rPr>
@@ -1088,7 +1088,7 @@
               <w14:ligatures w14:val="standardContextual"/>
             </w:rPr>
           </w:pPr>
-          <w:hyperlink w:anchor="_Toc229234236" w:history="1">
+          <w:hyperlink w:anchor="_Toc229336896" w:history="1">
             <w:r>
               <w:rPr>
                 <w:rStyle w:val="Hyperlink"/>
@@ -1115,7 +1115,7 @@
                 <w:noProof/>
                 <w:webHidden/>
               </w:rPr>
-              <w:instrText xml:space="preserve"> PAGEREF _Toc229234236 \h </w:instrText>
+              <w:instrText xml:space="preserve"> PAGEREF _Toc229336896 \h </w:instrText>
             </w:r>
             <w:r>
               <w:rPr>
@@ -1160,7 +1160,7 @@
               <w14:ligatures w14:val="standardContextual"/>
             </w:rPr>
           </w:pPr>
-          <w:hyperlink w:anchor="_Toc229234237" w:history="1">
+          <w:hyperlink w:anchor="_Toc229336897" w:history="1">
             <w:r>
               <w:rPr>
                 <w:rStyle w:val="Hyperlink"/>
@@ -1187,7 +1187,7 @@
                 <w:noProof/>
                 <w:webHidden/>
               </w:rPr>
-              <w:instrText xml:space="preserve"> PAGEREF _Toc229234237 \h </w:instrText>
+              <w:instrText xml:space="preserve"> PAGEREF _Toc229336897 \h </w:instrText>
             </w:r>
             <w:r>
               <w:rPr>
@@ -1232,7 +1232,7 @@
               <w14:ligatures w14:val="standardContextual"/>
             </w:rPr>
           </w:pPr>
-          <w:hyperlink w:anchor="_Toc229234238" w:history="1">
+          <w:hyperlink w:anchor="_Toc229336898" w:history="1">
             <w:r>
               <w:rPr>
                 <w:rStyle w:val="Hyperlink"/>
@@ -1259,7 +1259,7 @@
                 <w:noProof/>
                 <w:webHidden/>
               </w:rPr>
-              <w:instrText xml:space="preserve"> PAGEREF _Toc229234238 \h </w:instrText>
+              <w:instrText xml:space="preserve"> PAGEREF _Toc229336898 \h </w:instrText>
             </w:r>
             <w:r>
               <w:rPr>
@@ -1304,7 +1304,7 @@
               <w14:ligatures w14:val="standardContextual"/>
             </w:rPr>
           </w:pPr>
-          <w:hyperlink w:anchor="_Toc229234239" w:history="1">
+          <w:hyperlink w:anchor="_Toc229336899" w:history="1">
             <w:r>
               <w:rPr>
                 <w:rStyle w:val="Hyperlink"/>
@@ -1331,7 +1331,7 @@
                 <w:noProof/>
                 <w:webHidden/>
               </w:rPr>
-              <w:instrText xml:space="preserve"> PAGEREF _Toc229234239 \h </w:instrText>
+              <w:instrText xml:space="preserve"> PAGEREF _Toc229336899 \h </w:instrText>
             </w:r>
             <w:r>
               <w:rPr>
@@ -1376,7 +1376,7 @@
               <w14:ligatures w14:val="standardContextual"/>
             </w:rPr>
           </w:pPr>
-          <w:hyperlink w:anchor="_Toc229234240" w:history="1">
+          <w:hyperlink w:anchor="_Toc229336900" w:history="1">
             <w:r>
               <w:rPr>
                 <w:rStyle w:val="Hyperlink"/>
@@ -1403,7 +1403,7 @@
                 <w:noProof/>
                 <w:webHidden/>
               </w:rPr>
-              <w:instrText xml:space="preserve"> PAGEREF _Toc229234240 \h </w:instrText>
+              <w:instrText xml:space="preserve"> PAGEREF _Toc229336900 \h </w:instrText>
             </w:r>
             <w:r>
               <w:rPr>
@@ -1448,7 +1448,7 @@
               <w14:ligatures w14:val="standardContextual"/>
             </w:rPr>
           </w:pPr>
-          <w:hyperlink w:anchor="_Toc229234241" w:history="1">
+          <w:hyperlink w:anchor="_Toc229336901" w:history="1">
             <w:r>
               <w:rPr>
                 <w:rStyle w:val="Hyperlink"/>
@@ -1475,7 +1475,7 @@
                 <w:noProof/>
                 <w:webHidden/>
               </w:rPr>
-              <w:instrText xml:space="preserve"> PAGEREF _Toc229234241 \h </w:instrText>
+              <w:instrText xml:space="preserve"> PAGEREF _Toc229336901 \h </w:instrText>
             </w:r>
             <w:r>
               <w:rPr>
@@ -1520,7 +1520,7 @@
               <w14:ligatures w14:val="standardContextual"/>
             </w:rPr>
           </w:pPr>
-          <w:hyperlink w:anchor="_Toc229234242" w:history="1">
+          <w:hyperlink w:anchor="_Toc229336902" w:history="1">
             <w:r>
               <w:rPr>
                 <w:rStyle w:val="Hyperlink"/>
@@ -1547,7 +1547,7 @@
                 <w:noProof/>
                 <w:webHidden/>
               </w:rPr>
-              <w:instrText xml:space="preserve"> PAGEREF _Toc229234242 \h </w:instrText>
+              <w:instrText xml:space="preserve"> PAGEREF _Toc229336902 \h </w:instrText>
             </w:r>
             <w:r>
               <w:rPr>
@@ -1592,7 +1592,7 @@
               <w14:ligatures w14:val="standardContextual"/>
             </w:rPr>
           </w:pPr>
-          <w:hyperlink w:anchor="_Toc229234243" w:history="1">
+          <w:hyperlink w:anchor="_Toc229336903" w:history="1">
             <w:r>
               <w:rPr>
                 <w:rStyle w:val="Hyperlink"/>
@@ -1619,7 +1619,7 @@
                 <w:noProof/>
                 <w:webHidden/>
               </w:rPr>
-              <w:instrText xml:space="preserve"> PAGEREF _Toc229234243 \h </w:instrText>
+              <w:instrText xml:space="preserve"> PAGEREF _Toc229336903 \h </w:instrText>
             </w:r>
             <w:r>
               <w:rPr>
@@ -1664,7 +1664,7 @@
               <w14:ligatures w14:val="standardContextual"/>
             </w:rPr>
           </w:pPr>
-          <w:hyperlink w:anchor="_Toc229234244" w:history="1">
+          <w:hyperlink w:anchor="_Toc229336904" w:history="1">
             <w:r>
               <w:rPr>
                 <w:rStyle w:val="Hyperlink"/>
@@ -1691,7 +1691,7 @@
                 <w:noProof/>
                 <w:webHidden/>
               </w:rPr>
-              <w:instrText xml:space="preserve"> PAGEREF _Toc229234244 \h </w:instrText>
+              <w:instrText xml:space="preserve"> PAGEREF _Toc229336904 \h </w:instrText>
             </w:r>
             <w:r>
               <w:rPr>
@@ -1736,7 +1736,7 @@
               <w14:ligatures w14:val="standardContextual"/>
             </w:rPr>
           </w:pPr>
-          <w:hyperlink w:anchor="_Toc229234245" w:history="1">
+          <w:hyperlink w:anchor="_Toc229336905" w:history="1">
             <w:r>
               <w:rPr>
                 <w:rStyle w:val="Hyperlink"/>
@@ -1763,7 +1763,7 @@
                 <w:noProof/>
                 <w:webHidden/>
               </w:rPr>
-              <w:instrText xml:space="preserve"> PAGEREF _Toc229234245 \h </w:instrText>
+              <w:instrText xml:space="preserve"> PAGEREF _Toc229336905 \h </w:instrText>
             </w:r>
             <w:r>
               <w:rPr>
@@ -1808,7 +1808,7 @@
               <w14:ligatures w14:val="standardContextual"/>
             </w:rPr>
           </w:pPr>
-          <w:hyperlink w:anchor="_Toc229234246" w:history="1">
+          <w:hyperlink w:anchor="_Toc229336906" w:history="1">
             <w:r>
               <w:rPr>
                 <w:rStyle w:val="Hyperlink"/>
@@ -1835,7 +1835,7 @@
                 <w:noProof/>
                 <w:webHidden/>
               </w:rPr>
-              <w:instrText xml:space="preserve"> PAGEREF _Toc229234246 \h </w:instrText>
+              <w:instrText xml:space="preserve"> PAGEREF _Toc229336906 \h </w:instrText>
             </w:r>
             <w:r>
               <w:rPr>
@@ -1880,7 +1880,7 @@
               <w14:ligatures w14:val="standardContextual"/>
             </w:rPr>
           </w:pPr>
-          <w:hyperlink w:anchor="_Toc229234247" w:history="1">
+          <w:hyperlink w:anchor="_Toc229336907" w:history="1">
             <w:r>
               <w:rPr>
                 <w:rStyle w:val="Hyperlink"/>
@@ -1907,7 +1907,7 @@
                 <w:noProof/>
                 <w:webHidden/>
               </w:rPr>
-              <w:instrText xml:space="preserve"> PAGEREF _Toc229234247 \h </w:instrText>
+              <w:instrText xml:space="preserve"> PAGEREF _Toc229336907 \h </w:instrText>
             </w:r>
             <w:r>
               <w:rPr>
@@ -1952,7 +1952,7 @@
               <w14:ligatures w14:val="standardContextual"/>
             </w:rPr>
           </w:pPr>
-          <w:hyperlink w:anchor="_Toc229234248" w:history="1">
+          <w:hyperlink w:anchor="_Toc229336908" w:history="1">
             <w:r>
               <w:rPr>
                 <w:rStyle w:val="Hyperlink"/>
@@ -1979,7 +1979,7 @@
                 <w:noProof/>
                 <w:webHidden/>
               </w:rPr>
-              <w:instrText xml:space="preserve"> PAGEREF _Toc229234248 \h </w:instrText>
+              <w:instrText xml:space="preserve"> PAGEREF _Toc229336908 \h </w:instrText>
             </w:r>
             <w:r>
               <w:rPr>
@@ -2024,7 +2024,7 @@
               <w14:ligatures w14:val="standardContextual"/>
             </w:rPr>
           </w:pPr>
-          <w:hyperlink w:anchor="_Toc229234249" w:history="1">
+          <w:hyperlink w:anchor="_Toc229336909" w:history="1">
             <w:r>
               <w:rPr>
                 <w:rStyle w:val="Hyperlink"/>
@@ -2051,7 +2051,7 @@
                 <w:noProof/>
                 <w:webHidden/>
               </w:rPr>
-              <w:instrText xml:space="preserve"> PAGEREF _Toc229234249 \h </w:instrText>
+              <w:instrText xml:space="preserve"> PAGEREF _Toc229336909 \h </w:instrText>
             </w:r>
             <w:r>
               <w:rPr>
@@ -2096,7 +2096,7 @@
               <w14:ligatures w14:val="standardContextual"/>
             </w:rPr>
           </w:pPr>
-          <w:hyperlink w:anchor="_Toc229234250" w:history="1">
+          <w:hyperlink w:anchor="_Toc229336910" w:history="1">
             <w:r>
               <w:rPr>
                 <w:rStyle w:val="Hyperlink"/>
@@ -2123,7 +2123,7 @@
                 <w:noProof/>
                 <w:webHidden/>
               </w:rPr>
-              <w:instrText xml:space="preserve"> PAGEREF _Toc229234250 \h </w:instrText>
+              <w:instrText xml:space="preserve"> PAGEREF _Toc229336910 \h </w:instrText>
             </w:r>
             <w:r>
               <w:rPr>
@@ -2168,7 +2168,7 @@
               <w14:ligatures w14:val="standardContextual"/>
             </w:rPr>
           </w:pPr>
-          <w:hyperlink w:anchor="_Toc229234251" w:history="1">
+          <w:hyperlink w:anchor="_Toc229336911" w:history="1">
             <w:r>
               <w:rPr>
                 <w:rStyle w:val="Hyperlink"/>
@@ -2195,7 +2195,7 @@
                 <w:noProof/>
                 <w:webHidden/>
               </w:rPr>
-              <w:instrText xml:space="preserve"> PAGEREF _Toc229234251 \h </w:instrText>
+              <w:instrText xml:space="preserve"> PAGEREF _Toc229336911 \h </w:instrText>
             </w:r>
             <w:r>
               <w:rPr>
@@ -2240,7 +2240,7 @@
               <w14:ligatures w14:val="standardContextual"/>
             </w:rPr>
           </w:pPr>
-          <w:hyperlink w:anchor="_Toc229234252" w:history="1">
+          <w:hyperlink w:anchor="_Toc229336912" w:history="1">
             <w:r>
               <w:rPr>
                 <w:rStyle w:val="Hyperlink"/>
@@ -2267,7 +2267,7 @@
                 <w:noProof/>
                 <w:webHidden/>
               </w:rPr>
-              <w:instrText xml:space="preserve"> PAGEREF _Toc229234252 \h </w:instrText>
+              <w:instrText xml:space="preserve"> PAGEREF _Toc229336912 \h </w:instrText>
             </w:r>
             <w:r>
               <w:rPr>
@@ -2312,7 +2312,7 @@
               <w14:ligatures w14:val="standardContextual"/>
             </w:rPr>
           </w:pPr>
-          <w:hyperlink w:anchor="_Toc229234253" w:history="1">
+          <w:hyperlink w:anchor="_Toc229336913" w:history="1">
             <w:r>
               <w:rPr>
                 <w:rStyle w:val="Hyperlink"/>
@@ -2339,7 +2339,7 @@
                 <w:noProof/>
                 <w:webHidden/>
               </w:rPr>
-              <w:instrText xml:space="preserve"> PAGEREF _Toc229234253 \h </w:instrText>
+              <w:instrText xml:space="preserve"> PAGEREF _Toc229336913 \h </w:instrText>
             </w:r>
             <w:r>
               <w:rPr>
@@ -2384,7 +2384,7 @@
               <w14:ligatures w14:val="standardContextual"/>
             </w:rPr>
           </w:pPr>
-          <w:hyperlink w:anchor="_Toc229234254" w:history="1">
+          <w:hyperlink w:anchor="_Toc229336914" w:history="1">
             <w:r>
               <w:rPr>
                 <w:rStyle w:val="Hyperlink"/>
@@ -2411,7 +2411,7 @@
                 <w:noProof/>
                 <w:webHidden/>
               </w:rPr>
-              <w:instrText xml:space="preserve"> PAGEREF _Toc229234254 \h </w:instrText>
+              <w:instrText xml:space="preserve"> PAGEREF _Toc229336914 \h </w:instrText>
             </w:r>
             <w:r>
               <w:rPr>
@@ -2456,7 +2456,7 @@
               <w14:ligatures w14:val="standardContextual"/>
             </w:rPr>
           </w:pPr>
-          <w:hyperlink w:anchor="_Toc229234255" w:history="1">
+          <w:hyperlink w:anchor="_Toc229336915" w:history="1">
             <w:r>
               <w:rPr>
                 <w:rStyle w:val="Hyperlink"/>
@@ -2483,7 +2483,7 @@
                 <w:noProof/>
                 <w:webHidden/>
               </w:rPr>
-              <w:instrText xml:space="preserve"> PAGEREF _Toc229234255 \h </w:instrText>
+              <w:instrText xml:space="preserve"> PAGEREF _Toc229336915 \h </w:instrText>
             </w:r>
             <w:r>
               <w:rPr>
@@ -2528,7 +2528,7 @@
               <w14:ligatures w14:val="standardContextual"/>
             </w:rPr>
           </w:pPr>
-          <w:hyperlink w:anchor="_Toc229234256" w:history="1">
+          <w:hyperlink w:anchor="_Toc229336916" w:history="1">
             <w:r>
               <w:rPr>
                 <w:rStyle w:val="Hyperlink"/>
@@ -2555,7 +2555,7 @@
                 <w:noProof/>
                 <w:webHidden/>
               </w:rPr>
-              <w:instrText xml:space="preserve"> PAGEREF _Toc229234256 \h </w:instrText>
+              <w:instrText xml:space="preserve"> PAGEREF _Toc229336916 \h </w:instrText>
             </w:r>
             <w:r>
               <w:rPr>
@@ -2600,7 +2600,7 @@
               <w14:ligatures w14:val="standardContextual"/>
             </w:rPr>
           </w:pPr>
-          <w:hyperlink w:anchor="_Toc229234257" w:history="1">
+          <w:hyperlink w:anchor="_Toc229336917" w:history="1">
             <w:r>
               <w:rPr>
                 <w:rStyle w:val="Hyperlink"/>
@@ -2627,7 +2627,7 @@
                 <w:noProof/>
                 <w:webHidden/>
               </w:rPr>
-              <w:instrText xml:space="preserve"> PAGEREF _Toc229234257 \h </w:instrText>
+              <w:instrText xml:space="preserve"> PAGEREF _Toc229336917 \h </w:instrText>
             </w:r>
             <w:r>
               <w:rPr>
@@ -2672,7 +2672,7 @@
               <w14:ligatures w14:val="standardContextual"/>
             </w:rPr>
           </w:pPr>
-          <w:hyperlink w:anchor="_Toc229234258" w:history="1">
+          <w:hyperlink w:anchor="_Toc229336918" w:history="1">
             <w:r>
               <w:rPr>
                 <w:rStyle w:val="Hyperlink"/>
@@ -2699,7 +2699,7 @@
                 <w:noProof/>
                 <w:webHidden/>
               </w:rPr>
-              <w:instrText xml:space="preserve"> PAGEREF _Toc229234258 \h </w:instrText>
+              <w:instrText xml:space="preserve"> PAGEREF _Toc229336918 \h </w:instrText>
             </w:r>
             <w:r>
               <w:rPr>
@@ -2744,7 +2744,7 @@
               <w14:ligatures w14:val="standardContextual"/>
             </w:rPr>
           </w:pPr>
-          <w:hyperlink w:anchor="_Toc229234259" w:history="1">
+          <w:hyperlink w:anchor="_Toc229336919" w:history="1">
             <w:r>
               <w:rPr>
                 <w:rStyle w:val="Hyperlink"/>
@@ -2771,7 +2771,7 @@
                 <w:noProof/>
                 <w:webHidden/>
               </w:rPr>
-              <w:instrText xml:space="preserve"> PAGEREF _Toc229234259 \h </w:instrText>
+              <w:instrText xml:space="preserve"> PAGEREF _Toc229336919 \h </w:instrText>
             </w:r>
             <w:r>
               <w:rPr>
@@ -2816,7 +2816,7 @@
               <w14:ligatures w14:val="standardContextual"/>
             </w:rPr>
           </w:pPr>
-          <w:hyperlink w:anchor="_Toc229234260" w:history="1">
+          <w:hyperlink w:anchor="_Toc229336920" w:history="1">
             <w:r>
               <w:rPr>
                 <w:rStyle w:val="Hyperlink"/>
@@ -2843,7 +2843,7 @@
                 <w:noProof/>
                 <w:webHidden/>
               </w:rPr>
-              <w:instrText xml:space="preserve"> PAGEREF _Toc229234260 \h </w:instrText>
+              <w:instrText xml:space="preserve"> PAGEREF _Toc229336920 \h </w:instrText>
             </w:r>
             <w:r>
               <w:rPr>
@@ -2888,7 +2888,7 @@
               <w14:ligatures w14:val="standardContextual"/>
             </w:rPr>
           </w:pPr>
-          <w:hyperlink w:anchor="_Toc229234261" w:history="1">
+          <w:hyperlink w:anchor="_Toc229336921" w:history="1">
             <w:r>
               <w:rPr>
                 <w:rStyle w:val="Hyperlink"/>
@@ -2915,7 +2915,7 @@
                 <w:noProof/>
                 <w:webHidden/>
               </w:rPr>
-              <w:instrText xml:space="preserve"> PAGEREF _Toc229234261 \h </w:instrText>
+              <w:instrText xml:space="preserve"> PAGEREF _Toc229336921 \h </w:instrText>
             </w:r>
             <w:r>
               <w:rPr>
@@ -2960,7 +2960,7 @@
               <w14:ligatures w14:val="standardContextual"/>
             </w:rPr>
           </w:pPr>
-          <w:hyperlink w:anchor="_Toc229234262" w:history="1">
+          <w:hyperlink w:anchor="_Toc229336922" w:history="1">
             <w:r>
               <w:rPr>
                 <w:rStyle w:val="Hyperlink"/>
@@ -2987,7 +2987,7 @@
                 <w:noProof/>
                 <w:webHidden/>
               </w:rPr>
-              <w:instrText xml:space="preserve"> PAGEREF _Toc229234262 \h </w:instrText>
+              <w:instrText xml:space="preserve"> PAGEREF _Toc229336922 \h </w:instrText>
             </w:r>
             <w:r>
               <w:rPr>
@@ -3032,27 +3032,13 @@
               <w14:ligatures w14:val="standardContextual"/>
             </w:rPr>
           </w:pPr>
-          <w:hyperlink w:anchor="_Toc229234263" w:history="1">
+          <w:hyperlink w:anchor="_Toc229336923" w:history="1">
             <w:r>
               <w:rPr>
                 <w:rStyle w:val="Hyperlink"/>
                 <w:noProof/>
               </w:rPr>
-              <w:t>Appendix A: Scr</w:t>
-            </w:r>
-            <w:r>
-              <w:rPr>
-                <w:rStyle w:val="Hyperlink"/>
-                <w:noProof/>
-              </w:rPr>
-              <w:t>e</w:t>
-            </w:r>
-            <w:r>
-              <w:rPr>
-                <w:rStyle w:val="Hyperlink"/>
-                <w:noProof/>
-              </w:rPr>
-              <w:t>enshots</w:t>
+              <w:t>Appendix A: Screenshots</w:t>
             </w:r>
             <w:r>
               <w:rPr>
@@ -3073,7 +3059,7 @@
                 <w:noProof/>
                 <w:webHidden/>
               </w:rPr>
-              <w:instrText xml:space="preserve"> PAGEREF _Toc229234263 \h </w:instrText>
+              <w:instrText xml:space="preserve"> PAGEREF _Toc229336923 \h </w:instrText>
             </w:r>
             <w:r>
               <w:rPr>
@@ -3118,7 +3104,7 @@
               <w14:ligatures w14:val="standardContextual"/>
             </w:rPr>
           </w:pPr>
-          <w:hyperlink w:anchor="_Toc229234264" w:history="1">
+          <w:hyperlink w:anchor="_Toc229336924" w:history="1">
             <w:r>
               <w:rPr>
                 <w:rStyle w:val="Hyperlink"/>
@@ -3145,7 +3131,7 @@
                 <w:noProof/>
                 <w:webHidden/>
               </w:rPr>
-              <w:instrText xml:space="preserve"> PAGEREF _Toc229234264 \h </w:instrText>
+              <w:instrText xml:space="preserve"> PAGEREF _Toc229336924 \h </w:instrText>
             </w:r>
             <w:r>
               <w:rPr>
@@ -3190,7 +3176,7 @@
               <w14:ligatures w14:val="standardContextual"/>
             </w:rPr>
           </w:pPr>
-          <w:hyperlink w:anchor="_Toc229234265" w:history="1">
+          <w:hyperlink w:anchor="_Toc229336925" w:history="1">
             <w:r>
               <w:rPr>
                 <w:rStyle w:val="Hyperlink"/>
@@ -3217,7 +3203,7 @@
                 <w:noProof/>
                 <w:webHidden/>
               </w:rPr>
-              <w:instrText xml:space="preserve"> PAGEREF _Toc229234265 \h </w:instrText>
+              <w:instrText xml:space="preserve"> PAGEREF _Toc229336925 \h </w:instrText>
             </w:r>
             <w:r>
               <w:rPr>
@@ -3262,7 +3248,7 @@
               <w14:ligatures w14:val="standardContextual"/>
             </w:rPr>
           </w:pPr>
-          <w:hyperlink w:anchor="_Toc229234266" w:history="1">
+          <w:hyperlink w:anchor="_Toc229336926" w:history="1">
             <w:r>
               <w:rPr>
                 <w:rStyle w:val="Hyperlink"/>
@@ -3289,7 +3275,7 @@
                 <w:noProof/>
                 <w:webHidden/>
               </w:rPr>
-              <w:instrText xml:space="preserve"> PAGEREF _Toc229234266 \h </w:instrText>
+              <w:instrText xml:space="preserve"> PAGEREF _Toc229336926 \h </w:instrText>
             </w:r>
             <w:r>
               <w:rPr>
@@ -3334,7 +3320,7 @@
               <w14:ligatures w14:val="standardContextual"/>
             </w:rPr>
           </w:pPr>
-          <w:hyperlink w:anchor="_Toc229234267" w:history="1">
+          <w:hyperlink w:anchor="_Toc229336927" w:history="1">
             <w:r>
               <w:rPr>
                 <w:rStyle w:val="Hyperlink"/>
@@ -3361,7 +3347,7 @@
                 <w:noProof/>
                 <w:webHidden/>
               </w:rPr>
-              <w:instrText xml:space="preserve"> PAGEREF _Toc229234267 \h </w:instrText>
+              <w:instrText xml:space="preserve"> PAGEREF _Toc229336927 \h </w:instrText>
             </w:r>
             <w:r>
               <w:rPr>
@@ -3406,12 +3392,98 @@
               <w14:ligatures w14:val="standardContextual"/>
             </w:rPr>
           </w:pPr>
-          <w:hyperlink w:anchor="_Toc229234268" w:history="1">
+          <w:hyperlink w:anchor="_Toc229336928" w:history="1">
             <w:r>
               <w:rPr>
                 <w:rStyle w:val="Hyperlink"/>
                 <w:noProof/>
               </w:rPr>
+              <w:t>Video Li</w:t>
+            </w:r>
+            <w:r>
+              <w:rPr>
+                <w:rStyle w:val="Hyperlink"/>
+                <w:noProof/>
+              </w:rPr>
+              <w:t>n</w:t>
+            </w:r>
+            <w:r>
+              <w:rPr>
+                <w:rStyle w:val="Hyperlink"/>
+                <w:noProof/>
+              </w:rPr>
+              <w:t>k:</w:t>
+            </w:r>
+            <w:r>
+              <w:rPr>
+                <w:noProof/>
+                <w:webHidden/>
+              </w:rPr>
+              <w:tab/>
+            </w:r>
+            <w:r>
+              <w:rPr>
+                <w:noProof/>
+                <w:webHidden/>
+              </w:rPr>
+              <w:fldChar w:fldCharType="begin"/>
+            </w:r>
+            <w:r>
+              <w:rPr>
+                <w:noProof/>
+                <w:webHidden/>
+              </w:rPr>
+              <w:instrText xml:space="preserve"> PAGEREF _Toc229336928 \h </w:instrText>
+            </w:r>
+            <w:r>
+              <w:rPr>
+                <w:noProof/>
+                <w:webHidden/>
+              </w:rPr>
+            </w:r>
+            <w:r>
+              <w:rPr>
+                <w:noProof/>
+                <w:webHidden/>
+              </w:rPr>
+              <w:fldChar w:fldCharType="separate"/>
+            </w:r>
+            <w:r>
+              <w:rPr>
+                <w:noProof/>
+                <w:webHidden/>
+              </w:rPr>
+              <w:t>23</w:t>
+            </w:r>
+            <w:r>
+              <w:rPr>
+                <w:noProof/>
+                <w:webHidden/>
+              </w:rPr>
+              <w:fldChar w:fldCharType="end"/>
+            </w:r>
+          </w:hyperlink>
+        </w:p>
+        <w:p>
+          <w:pPr>
+            <w:pStyle w:val="TOC1"/>
+            <w:tabs>
+              <w:tab w:val="right" w:leader="dot" w:pos="9350"/>
+            </w:tabs>
+            <w:rPr>
+              <w:rFonts w:eastAsiaTheme="minorEastAsia"/>
+              <w:noProof/>
+              <w:kern w:val="2"/>
+              <w:lang w:val="en-IN" w:eastAsia="en-GB"/>
+              <w14:ligatures w14:val="standardContextual"/>
+            </w:rPr>
+          </w:pPr>
+          <w:hyperlink w:anchor="_Toc229336929" w:history="1">
+            <w:r>
+              <w:rPr>
+                <w:rStyle w:val="Hyperlink"/>
+                <w:noProof/>
+              </w:rPr>
               <w:t>References</w:t>
             </w:r>
             <w:r>
@@ -3433,7 +3505,7 @@
                 <w:noProof/>
                 <w:webHidden/>
               </w:rPr>
-              <w:instrText xml:space="preserve"> PAGEREF _Toc229234268 \h </w:instrText>
+              <w:instrText xml:space="preserve"> PAGEREF _Toc229336929 \h </w:instrText>
             </w:r>
             <w:r>
               <w:rPr>
@@ -3476,7 +3548,7 @@
         <w:pStyle w:val="Heading1"/>
       </w:pPr>
       <w:bookmarkStart w:id="0" w:name="executive-summary"/>
-      <w:bookmarkStart w:id="1" w:name="_Toc229234222"/>
+      <w:bookmarkStart w:id="1" w:name="_Toc229336882"/>
       <w:r>
         <w:t>Executive Summary</w:t>
       </w:r>
@@ -3496,11 +3568,8 @@
         <w:pStyle w:val="BodyText"/>
       </w:pPr>
       <w:r>
-        <w:t xml:space="preserve">The final system achieves a ROC-AUC score of approximately 0.93 with a Random Forest classifier and is deployed as a scalable, containerised API with automated testing and </w:t>
-      </w:r>
-      <w:r>
         <w:lastRenderedPageBreak/>
-        <w:t>monitoring. All code, configurations, and documentation are version-controlled in a GitHub repository, satisfying all nine assignment tasks for a total of 50 marks.</w:t>
+        <w:t>The final system achieves a ROC-AUC score of approximately 0.93 with a Random Forest classifier and is deployed as a scalable, containerised API with automated testing and monitoring. All code, configurations, and documentation are version-controlled in a GitHub repository, satisfying all nine assignment tasks for a total of 50 marks.</w:t>
       </w:r>
     </w:p>
     <w:p>
@@ -3508,7 +3577,7 @@
         <w:rPr>
           <w:noProof/>
         </w:rPr>
-        <w:pict w14:anchorId="34A32EF2">
+        <w:pict w14:anchorId="3CB2B428">
           <v:rect id="_x0000_i1045" alt="" style="width:451.3pt;height:.05pt;mso-width-percent:0;mso-height-percent:0;mso-width-percent:0;mso-height-percent:0" o:hralign="center" o:hrstd="t" o:hr="t"/>
         </w:pict>
       </w:r>
@@ -3518,7 +3587,7 @@
         <w:pStyle w:val="Heading1"/>
       </w:pPr>
       <w:bookmarkStart w:id="2" w:name="Xb1097bf672c9eb1fc0a05e48e0006c51348586b"/>
-      <w:bookmarkStart w:id="3" w:name="_Toc229234223"/>
+      <w:bookmarkStart w:id="3" w:name="_Toc229336883"/>
       <w:r>
         <w:t>1. Data Acquisition and Exploratory Data Analysis</w:t>
       </w:r>
@@ -3530,7 +3599,7 @@
         <w:pStyle w:val="Heading2"/>
       </w:pPr>
       <w:bookmarkStart w:id="4" w:name="dataset-overview"/>
-      <w:bookmarkStart w:id="5" w:name="_Toc229234224"/>
+      <w:bookmarkStart w:id="5" w:name="_Toc229336884"/>
       <w:r>
         <w:t>1.1 Dataset Overview</w:t>
       </w:r>
@@ -3678,7 +3747,7 @@
         <w:pStyle w:val="Heading2"/>
       </w:pPr>
       <w:bookmarkStart w:id="6" w:name="feature-descriptions"/>
-      <w:bookmarkStart w:id="7" w:name="_Toc229234225"/>
+      <w:bookmarkStart w:id="7" w:name="_Toc229336885"/>
       <w:r>
         <w:t>1.2 Feature Descriptions</w:t>
       </w:r>
@@ -4296,7 +4365,7 @@
         <w:pStyle w:val="Heading2"/>
       </w:pPr>
       <w:bookmarkStart w:id="8" w:name="data-acquisition-script"/>
-      <w:bookmarkStart w:id="9" w:name="_Toc229234226"/>
+      <w:bookmarkStart w:id="9" w:name="_Toc229336886"/>
       <w:r>
         <w:lastRenderedPageBreak/>
         <w:t>1.3 Data Acquisition Script</w:t>
@@ -4495,7 +4564,7 @@
         <w:pStyle w:val="Heading2"/>
       </w:pPr>
       <w:bookmarkStart w:id="10" w:name="exploratory-data-analysis-findings"/>
-      <w:bookmarkStart w:id="11" w:name="_Toc229234227"/>
+      <w:bookmarkStart w:id="11" w:name="_Toc229336887"/>
       <w:r>
         <w:t>1.4 Exploratory Data Analysis Findings</w:t>
       </w:r>
@@ -4899,7 +4968,7 @@
         <w:rPr>
           <w:noProof/>
         </w:rPr>
-        <w:pict w14:anchorId="2F588A6A">
+        <w:pict w14:anchorId="07847E06">
           <v:rect id="_x0000_i1044" alt="" style="width:451.3pt;height:.05pt;mso-width-percent:0;mso-height-percent:0;mso-width-percent:0;mso-height-percent:0" o:hralign="center" o:hrstd="t" o:hr="t"/>
         </w:pict>
       </w:r>
@@ -4909,7 +4978,7 @@
         <w:pStyle w:val="Heading1"/>
       </w:pPr>
       <w:bookmarkStart w:id="12" w:name="Xa799d93673afa10bf90c9043574061a98caadb1"/>
-      <w:bookmarkStart w:id="13" w:name="_Toc229234228"/>
+      <w:bookmarkStart w:id="13" w:name="_Toc229336888"/>
       <w:r>
         <w:lastRenderedPageBreak/>
         <w:t>2. Feature Engineering and Model Development</w:t>
@@ -4922,7 +4991,7 @@
         <w:pStyle w:val="Heading2"/>
       </w:pPr>
       <w:bookmarkStart w:id="14" w:name="preprocessing-pipeline"/>
-      <w:bookmarkStart w:id="15" w:name="_Toc229234229"/>
+      <w:bookmarkStart w:id="15" w:name="_Toc229336889"/>
       <w:r>
         <w:t>2.1 Preprocessing Pipeline</w:t>
       </w:r>
@@ -5143,7 +5212,7 @@
         <w:pStyle w:val="Heading2"/>
       </w:pPr>
       <w:bookmarkStart w:id="16" w:name="traintest-split"/>
-      <w:bookmarkStart w:id="17" w:name="_Toc229234230"/>
+      <w:bookmarkStart w:id="17" w:name="_Toc229336890"/>
       <w:r>
         <w:t>2.2 Train/Test Split</w:t>
       </w:r>
@@ -5260,7 +5329,7 @@
         <w:pStyle w:val="Heading2"/>
       </w:pPr>
       <w:bookmarkStart w:id="18" w:name="model-selection"/>
-      <w:bookmarkStart w:id="19" w:name="_Toc229234231"/>
+      <w:bookmarkStart w:id="19" w:name="_Toc229336891"/>
       <w:r>
         <w:t>2.3 Model Selection</w:t>
       </w:r>
@@ -5317,7 +5386,7 @@
         <w:pStyle w:val="Heading2"/>
       </w:pPr>
       <w:bookmarkStart w:id="20" w:name="model-evaluation-results"/>
-      <w:bookmarkStart w:id="21" w:name="_Toc229234232"/>
+      <w:bookmarkStart w:id="21" w:name="_Toc229336892"/>
       <w:r>
         <w:lastRenderedPageBreak/>
         <w:t>2.4 Model Evaluation Results</w:t>
@@ -5663,7 +5732,7 @@
         <w:rPr>
           <w:noProof/>
         </w:rPr>
-        <w:pict w14:anchorId="69B91608">
+        <w:pict w14:anchorId="6C593CD0">
           <v:rect id="_x0000_i1043" alt="" style="width:451.3pt;height:.05pt;mso-width-percent:0;mso-height-percent:0;mso-width-percent:0;mso-height-percent:0" o:hralign="center" o:hrstd="t" o:hr="t"/>
         </w:pict>
       </w:r>
@@ -5673,7 +5742,7 @@
         <w:pStyle w:val="Heading1"/>
       </w:pPr>
       <w:bookmarkStart w:id="22" w:name="experiment-tracking"/>
-      <w:bookmarkStart w:id="23" w:name="_Toc229234233"/>
+      <w:bookmarkStart w:id="23" w:name="_Toc229336893"/>
       <w:r>
         <w:t>3. Experiment Tracking</w:t>
       </w:r>
@@ -5685,7 +5754,7 @@
         <w:pStyle w:val="Heading2"/>
       </w:pPr>
       <w:bookmarkStart w:id="24" w:name="mlflow-integration"/>
-      <w:bookmarkStart w:id="25" w:name="_Toc229234234"/>
+      <w:bookmarkStart w:id="25" w:name="_Toc229336894"/>
       <w:r>
         <w:t>3.1 MLflow Integration</w:t>
       </w:r>
@@ -5746,7 +5815,7 @@
         <w:pStyle w:val="Heading2"/>
       </w:pPr>
       <w:bookmarkStart w:id="26" w:name="logged-artefacts"/>
-      <w:bookmarkStart w:id="27" w:name="_Toc229234235"/>
+      <w:bookmarkStart w:id="27" w:name="_Toc229336895"/>
       <w:r>
         <w:t>3.2 Logged Artefacts</w:t>
       </w:r>
@@ -5849,7 +5918,7 @@
         <w:pStyle w:val="Heading2"/>
       </w:pPr>
       <w:bookmarkStart w:id="28" w:name="viewing-experiments"/>
-      <w:bookmarkStart w:id="29" w:name="_Toc229234236"/>
+      <w:bookmarkStart w:id="29" w:name="_Toc229336896"/>
       <w:r>
         <w:lastRenderedPageBreak/>
         <w:t>3.3 Viewing Experiments</w:t>
@@ -5896,7 +5965,7 @@
         <w:rPr>
           <w:noProof/>
         </w:rPr>
-        <w:pict w14:anchorId="38CA06B7">
+        <w:pict w14:anchorId="67E98AA7">
           <v:rect id="_x0000_i1042" alt="" style="width:451.3pt;height:.05pt;mso-width-percent:0;mso-height-percent:0;mso-width-percent:0;mso-height-percent:0" o:hralign="center" o:hrstd="t" o:hr="t"/>
         </w:pict>
       </w:r>
@@ -5906,7 +5975,7 @@
         <w:pStyle w:val="Heading1"/>
       </w:pPr>
       <w:bookmarkStart w:id="30" w:name="model-packaging-and-reproducibility"/>
-      <w:bookmarkStart w:id="31" w:name="_Toc229234237"/>
+      <w:bookmarkStart w:id="31" w:name="_Toc229336897"/>
       <w:r>
         <w:t>4. Model Packaging and Reproducibility</w:t>
       </w:r>
@@ -5918,7 +5987,7 @@
         <w:pStyle w:val="Heading2"/>
       </w:pPr>
       <w:bookmarkStart w:id="32" w:name="model-serialisation"/>
-      <w:bookmarkStart w:id="33" w:name="_Toc229234238"/>
+      <w:bookmarkStart w:id="33" w:name="_Toc229336898"/>
       <w:r>
         <w:t>4.1 Model Serialisation</w:t>
       </w:r>
@@ -6035,7 +6104,7 @@
         <w:pStyle w:val="Heading2"/>
       </w:pPr>
       <w:bookmarkStart w:id="34" w:name="reproducibility-guarantees"/>
-      <w:bookmarkStart w:id="35" w:name="_Toc229234239"/>
+      <w:bookmarkStart w:id="35" w:name="_Toc229336899"/>
       <w:r>
         <w:t>4.2 Reproducibility Guarantees</w:t>
       </w:r>
@@ -6082,7 +6151,7 @@
         <w:pStyle w:val="Heading2"/>
       </w:pPr>
       <w:bookmarkStart w:id="36" w:name="inference-pipeline"/>
-      <w:bookmarkStart w:id="37" w:name="_Toc229234240"/>
+      <w:bookmarkStart w:id="37" w:name="_Toc229336900"/>
       <w:r>
         <w:t>4.3 Inference Pipeline</w:t>
       </w:r>
@@ -6199,7 +6268,7 @@
         <w:rPr>
           <w:noProof/>
         </w:rPr>
-        <w:pict w14:anchorId="716E227D">
+        <w:pict w14:anchorId="4E4A40B0">
           <v:rect id="_x0000_i1041" alt="" style="width:451.3pt;height:.05pt;mso-width-percent:0;mso-height-percent:0;mso-width-percent:0;mso-height-percent:0" o:hralign="center" o:hrstd="t" o:hr="t"/>
         </w:pict>
       </w:r>
@@ -6209,7 +6278,7 @@
         <w:pStyle w:val="Heading1"/>
       </w:pPr>
       <w:bookmarkStart w:id="38" w:name="cicd-pipeline-and-automated-testing"/>
-      <w:bookmarkStart w:id="39" w:name="_Toc229234241"/>
+      <w:bookmarkStart w:id="39" w:name="_Toc229336901"/>
       <w:r>
         <w:lastRenderedPageBreak/>
         <w:t>5. CI/CD Pipeline and Automated Testing</w:t>
@@ -6222,7 +6291,7 @@
         <w:pStyle w:val="Heading2"/>
       </w:pPr>
       <w:bookmarkStart w:id="40" w:name="unit-test-suite"/>
-      <w:bookmarkStart w:id="41" w:name="_Toc229234242"/>
+      <w:bookmarkStart w:id="41" w:name="_Toc229336902"/>
       <w:r>
         <w:t>5.1 Unit Test Suite</w:t>
       </w:r>
@@ -6373,7 +6442,7 @@
         <w:pStyle w:val="Heading2"/>
       </w:pPr>
       <w:bookmarkStart w:id="42" w:name="github-actions-pipeline"/>
-      <w:bookmarkStart w:id="43" w:name="_Toc229234243"/>
+      <w:bookmarkStart w:id="43" w:name="_Toc229336903"/>
       <w:r>
         <w:t>5.2 GitHub Actions Pipeline</w:t>
       </w:r>
@@ -6502,7 +6571,7 @@
         <w:rPr>
           <w:noProof/>
         </w:rPr>
-        <w:pict w14:anchorId="1C2A969D">
+        <w:pict w14:anchorId="13DC9D31">
           <v:rect id="_x0000_i1040" alt="" style="width:451.3pt;height:.05pt;mso-width-percent:0;mso-height-percent:0;mso-width-percent:0;mso-height-percent:0" o:hralign="center" o:hrstd="t" o:hr="t"/>
         </w:pict>
       </w:r>
@@ -6512,7 +6581,7 @@
         <w:pStyle w:val="Heading1"/>
       </w:pPr>
       <w:bookmarkStart w:id="44" w:name="model-containerisation"/>
-      <w:bookmarkStart w:id="45" w:name="_Toc229234244"/>
+      <w:bookmarkStart w:id="45" w:name="_Toc229336904"/>
       <w:r>
         <w:lastRenderedPageBreak/>
         <w:t>6. Model Containerisation</w:t>
@@ -6525,7 +6594,7 @@
         <w:pStyle w:val="Heading2"/>
       </w:pPr>
       <w:bookmarkStart w:id="46" w:name="dockerfile-design"/>
-      <w:bookmarkStart w:id="47" w:name="_Toc229234245"/>
+      <w:bookmarkStart w:id="47" w:name="_Toc229336905"/>
       <w:r>
         <w:t>6.1 Dockerfile Design</w:t>
       </w:r>
@@ -6660,7 +6729,7 @@
         <w:pStyle w:val="Heading2"/>
       </w:pPr>
       <w:bookmarkStart w:id="48" w:name="api-design"/>
-      <w:bookmarkStart w:id="49" w:name="_Toc229234246"/>
+      <w:bookmarkStart w:id="49" w:name="_Toc229336906"/>
       <w:r>
         <w:t>6.2 API Design</w:t>
       </w:r>
@@ -6751,7 +6820,7 @@
         <w:pStyle w:val="Heading2"/>
       </w:pPr>
       <w:bookmarkStart w:id="50" w:name="running-the-container"/>
-      <w:bookmarkStart w:id="51" w:name="_Toc229234247"/>
+      <w:bookmarkStart w:id="51" w:name="_Toc229336907"/>
       <w:r>
         <w:t>6.3 Running the Container</w:t>
       </w:r>
@@ -6959,7 +7028,7 @@
         <w:rPr>
           <w:noProof/>
         </w:rPr>
-        <w:pict w14:anchorId="37209896">
+        <w:pict w14:anchorId="3F1AE87F">
           <v:rect id="_x0000_i1039" alt="" style="width:451.3pt;height:.05pt;mso-width-percent:0;mso-height-percent:0;mso-width-percent:0;mso-height-percent:0" o:hralign="center" o:hrstd="t" o:hr="t"/>
         </w:pict>
       </w:r>
@@ -6969,7 +7038,7 @@
         <w:pStyle w:val="Heading1"/>
       </w:pPr>
       <w:bookmarkStart w:id="52" w:name="production-deployment"/>
-      <w:bookmarkStart w:id="53" w:name="_Toc229234248"/>
+      <w:bookmarkStart w:id="53" w:name="_Toc229336908"/>
       <w:r>
         <w:lastRenderedPageBreak/>
         <w:t>7. Production Deployment</w:t>
@@ -6982,7 +7051,7 @@
         <w:pStyle w:val="Heading2"/>
       </w:pPr>
       <w:bookmarkStart w:id="54" w:name="architecture"/>
-      <w:bookmarkStart w:id="55" w:name="_Toc229234249"/>
+      <w:bookmarkStart w:id="55" w:name="_Toc229336909"/>
       <w:r>
         <w:t>7.1 Architecture</w:t>
       </w:r>
@@ -7092,7 +7161,7 @@
         <w:pStyle w:val="Heading2"/>
       </w:pPr>
       <w:bookmarkStart w:id="56" w:name="deployment-commands"/>
-      <w:bookmarkStart w:id="57" w:name="_Toc229234250"/>
+      <w:bookmarkStart w:id="57" w:name="_Toc229336910"/>
       <w:r>
         <w:t>7.2 Deployment Commands</w:t>
       </w:r>
@@ -7247,7 +7316,7 @@
         <w:pStyle w:val="Heading2"/>
       </w:pPr>
       <w:bookmarkStart w:id="58" w:name="deployment-manifest-highlights"/>
-      <w:bookmarkStart w:id="59" w:name="_Toc229234251"/>
+      <w:bookmarkStart w:id="59" w:name="_Toc229336911"/>
       <w:r>
         <w:t>7.3 Deployment Manifest Highlights</w:t>
       </w:r>
@@ -7461,7 +7530,7 @@
         <w:rPr>
           <w:noProof/>
         </w:rPr>
-        <w:pict w14:anchorId="2782B86E">
+        <w:pict w14:anchorId="1806D37D">
           <v:rect id="_x0000_i1038" alt="" style="width:451.3pt;height:.05pt;mso-width-percent:0;mso-height-percent:0;mso-width-percent:0;mso-height-percent:0" o:hralign="center" o:hrstd="t" o:hr="t"/>
         </w:pict>
       </w:r>
@@ -7471,7 +7540,7 @@
         <w:pStyle w:val="Heading1"/>
       </w:pPr>
       <w:bookmarkStart w:id="60" w:name="monitoring-and-logging"/>
-      <w:bookmarkStart w:id="61" w:name="_Toc229234252"/>
+      <w:bookmarkStart w:id="61" w:name="_Toc229336912"/>
       <w:r>
         <w:lastRenderedPageBreak/>
         <w:t>8. Monitoring and Logging</w:t>
@@ -7484,7 +7553,7 @@
         <w:pStyle w:val="Heading2"/>
       </w:pPr>
       <w:bookmarkStart w:id="62" w:name="application-logging"/>
-      <w:bookmarkStart w:id="63" w:name="_Toc229234253"/>
+      <w:bookmarkStart w:id="63" w:name="_Toc229336913"/>
       <w:r>
         <w:t>8.1 Application Logging</w:t>
       </w:r>
@@ -7971,7 +8040,7 @@
         <w:pStyle w:val="Heading2"/>
       </w:pPr>
       <w:bookmarkStart w:id="64" w:name="prometheus-and-grafana"/>
-      <w:bookmarkStart w:id="65" w:name="_Toc229234254"/>
+      <w:bookmarkStart w:id="65" w:name="_Toc229336914"/>
       <w:r>
         <w:t>8.2 Prometheus and Grafana</w:t>
       </w:r>
@@ -8133,7 +8202,7 @@
         <w:rPr>
           <w:noProof/>
         </w:rPr>
-        <w:pict w14:anchorId="317A5948">
+        <w:pict w14:anchorId="59CC17A1">
           <v:rect id="_x0000_i1037" alt="" style="width:451.3pt;height:.05pt;mso-width-percent:0;mso-height-percent:0;mso-width-percent:0;mso-height-percent:0" o:hralign="center" o:hrstd="t" o:hr="t"/>
         </w:pict>
       </w:r>
@@ -8143,7 +8212,7 @@
         <w:pStyle w:val="Heading1"/>
       </w:pPr>
       <w:bookmarkStart w:id="66" w:name="documentation-and-reporting"/>
-      <w:bookmarkStart w:id="67" w:name="_Toc229234255"/>
+      <w:bookmarkStart w:id="67" w:name="_Toc229336915"/>
       <w:r>
         <w:lastRenderedPageBreak/>
         <w:t>9. Documentation and Reporting</w:t>
@@ -8156,7 +8225,7 @@
         <w:pStyle w:val="Heading2"/>
       </w:pPr>
       <w:bookmarkStart w:id="68" w:name="setup-and-installation-instructions"/>
-      <w:bookmarkStart w:id="69" w:name="_Toc229234256"/>
+      <w:bookmarkStart w:id="69" w:name="_Toc229336916"/>
       <w:r>
         <w:t>9.1 Setup and Installation Instructions</w:t>
       </w:r>
@@ -8430,7 +8499,7 @@
         <w:pStyle w:val="Heading2"/>
       </w:pPr>
       <w:bookmarkStart w:id="70" w:name="eda-and-modelling-choices"/>
-      <w:bookmarkStart w:id="71" w:name="_Toc229234257"/>
+      <w:bookmarkStart w:id="71" w:name="_Toc229336917"/>
       <w:r>
         <w:t>9.2 EDA and Modelling Choices</w:t>
       </w:r>
@@ -8575,7 +8644,7 @@
         <w:pStyle w:val="Heading2"/>
       </w:pPr>
       <w:bookmarkStart w:id="72" w:name="experiment-tracking-summary"/>
-      <w:bookmarkStart w:id="73" w:name="_Toc229234258"/>
+      <w:bookmarkStart w:id="73" w:name="_Toc229336918"/>
       <w:r>
         <w:lastRenderedPageBreak/>
         <w:t>9.3 Experiment Tracking Summary</w:t>
@@ -8984,7 +9053,7 @@
         <w:pStyle w:val="Heading2"/>
       </w:pPr>
       <w:bookmarkStart w:id="74" w:name="architecture-diagram"/>
-      <w:bookmarkStart w:id="75" w:name="_Toc229234259"/>
+      <w:bookmarkStart w:id="75" w:name="_Toc229336919"/>
       <w:r>
         <w:t>9.4 Architecture Diagram</w:t>
       </w:r>
@@ -9271,7 +9340,7 @@
       <w:pPr>
         <w:pStyle w:val="Heading2"/>
       </w:pPr>
-      <w:bookmarkStart w:id="77" w:name="_Toc229234260"/>
+      <w:bookmarkStart w:id="77" w:name="_Toc229336920"/>
       <w:r>
         <w:t>9.5 CI/CD and Deployment Workflow Screenshots</w:t>
       </w:r>
@@ -9392,7 +9461,7 @@
         <w:pStyle w:val="Heading2"/>
       </w:pPr>
       <w:bookmarkStart w:id="78" w:name="deliverables-summary"/>
-      <w:bookmarkStart w:id="79" w:name="_Toc229234261"/>
+      <w:bookmarkStart w:id="79" w:name="_Toc229336921"/>
       <w:r>
         <w:t xml:space="preserve">9.6 </w:t>
       </w:r>
@@ -10084,7 +10153,7 @@
         <w:rPr>
           <w:noProof/>
         </w:rPr>
-        <w:pict w14:anchorId="0BC2AB57">
+        <w:pict w14:anchorId="7BD47759">
           <v:rect id="_x0000_i1036" alt="" style="width:451.3pt;height:.05pt;mso-width-percent:0;mso-height-percent:0;mso-width-percent:0;mso-height-percent:0" o:hralign="center" o:hrstd="t" o:hr="t"/>
         </w:pict>
       </w:r>
@@ -10094,7 +10163,7 @@
         <w:pStyle w:val="Heading1"/>
       </w:pPr>
       <w:bookmarkStart w:id="81" w:name="summary-and-conclusions"/>
-      <w:bookmarkStart w:id="82" w:name="_Toc229234262"/>
+      <w:bookmarkStart w:id="82" w:name="_Toc229336922"/>
       <w:r>
         <w:t>10. Summary and Conclusions</w:t>
       </w:r>
@@ -10230,7 +10299,7 @@
         <w:rPr>
           <w:noProof/>
         </w:rPr>
-        <w:pict w14:anchorId="501EE4D3">
+        <w:pict w14:anchorId="23AA57CA">
           <v:rect id="_x0000_i1035" alt="" style="width:451.3pt;height:.05pt;mso-width-percent:0;mso-height-percent:0;mso-width-percent:0;mso-height-percent:0" o:hralign="center" o:hrstd="t" o:hr="t"/>
         </w:pict>
       </w:r>
@@ -10240,7 +10309,7 @@
         <w:pStyle w:val="Heading1"/>
       </w:pPr>
       <w:bookmarkStart w:id="83" w:name="appendix-a-screenshots"/>
-      <w:bookmarkStart w:id="84" w:name="_Toc229234263"/>
+      <w:bookmarkStart w:id="84" w:name="_Toc229336923"/>
       <w:r>
         <w:t>Appendix A: Screenshots</w:t>
       </w:r>
@@ -10260,7 +10329,7 @@
         <w:pStyle w:val="Heading2"/>
       </w:pPr>
       <w:bookmarkStart w:id="85" w:name="a.1-github-actions-cicd-pipeline"/>
-      <w:bookmarkStart w:id="86" w:name="_Toc229234264"/>
+      <w:bookmarkStart w:id="86" w:name="_Toc229336924"/>
       <w:r>
         <w:t>A.1 GitHub Actions CI/CD Pipeline</w:t>
       </w:r>
@@ -10338,7 +10407,7 @@
         <w:rPr>
           <w:noProof/>
         </w:rPr>
-        <w:pict w14:anchorId="45A70FA3">
+        <w:pict w14:anchorId="1AF3F657">
           <v:rect id="_x0000_i1034" alt="" style="width:451.3pt;height:.05pt;mso-width-percent:0;mso-height-percent:0;mso-width-percent:0;mso-height-percent:0" o:hralign="center" o:hrstd="t" o:hr="t"/>
         </w:pict>
       </w:r>
@@ -10366,7 +10435,7 @@
           <w:noProof/>
         </w:rPr>
         <w:drawing>
-          <wp:inline distT="0" distB="0" distL="0" distR="0" wp14:anchorId="1DF97230" wp14:editId="465A4835">
+          <wp:inline distT="0" distB="0" distL="0" distR="0" wp14:anchorId="1DF97230" wp14:editId="4FCF9A8C">
             <wp:extent cx="5943600" cy="1007110"/>
             <wp:effectExtent l="0" t="0" r="0" b="0"/>
             <wp:docPr id="109" name="Picture 9" descr="Full size preview"/>
@@ -10420,7 +10489,7 @@
         <w:rPr>
           <w:noProof/>
         </w:rPr>
-        <w:pict w14:anchorId="6BA2A348">
+        <w:pict w14:anchorId="7B2827A5">
           <v:rect id="_x0000_i1033" alt="" style="width:451.3pt;height:.05pt;mso-width-percent:0;mso-height-percent:0;mso-width-percent:0;mso-height-percent:0" o:hralign="center" o:hrstd="t" o:hr="t"/>
         </w:pict>
       </w:r>
@@ -10493,7 +10562,7 @@
         <w:rPr>
           <w:noProof/>
         </w:rPr>
-        <w:pict w14:anchorId="6F255544">
+        <w:pict w14:anchorId="2B70D17C">
           <v:rect id="_x0000_i1032" alt="" style="width:451.3pt;height:.05pt;mso-width-percent:0;mso-height-percent:0;mso-width-percent:0;mso-height-percent:0" o:hralign="center" o:hrstd="t" o:hr="t"/>
         </w:pict>
       </w:r>
@@ -10503,7 +10572,7 @@
         <w:pStyle w:val="Heading2"/>
       </w:pPr>
       <w:bookmarkStart w:id="87" w:name="a.2-mlflow-experiment-tracking-dashboard"/>
-      <w:bookmarkStart w:id="88" w:name="_Toc229234265"/>
+      <w:bookmarkStart w:id="88" w:name="_Toc229336925"/>
       <w:r>
         <w:t>A.2 MLflow Experiment Tracking Dashboard</w:t>
       </w:r>
@@ -10572,7 +10641,7 @@
         <w:rPr>
           <w:noProof/>
         </w:rPr>
-        <w:pict w14:anchorId="02D0436E">
+        <w:pict w14:anchorId="7934F17B">
           <v:rect id="_x0000_i1031" alt="" style="width:451.3pt;height:.05pt;mso-width-percent:0;mso-height-percent:0;mso-width-percent:0;mso-height-percent:0" o:hralign="center" o:hrstd="t" o:hr="t"/>
         </w:pict>
       </w:r>
@@ -10640,7 +10709,7 @@
         <w:rPr>
           <w:noProof/>
         </w:rPr>
-        <w:pict w14:anchorId="587DEA24">
+        <w:pict w14:anchorId="51D19994">
           <v:rect id="_x0000_i1030" alt="" style="width:451.3pt;height:.05pt;mso-width-percent:0;mso-height-percent:0;mso-width-percent:0;mso-height-percent:0" o:hralign="center" o:hrstd="t" o:hr="t"/>
         </w:pict>
       </w:r>
@@ -10650,7 +10719,7 @@
         <w:pStyle w:val="Heading2"/>
       </w:pPr>
       <w:bookmarkStart w:id="89" w:name="a.3-docker-container"/>
-      <w:bookmarkStart w:id="90" w:name="_Toc229234266"/>
+      <w:bookmarkStart w:id="90" w:name="_Toc229336926"/>
       <w:r>
         <w:t>A.3 Docker Container</w:t>
       </w:r>
@@ -10727,7 +10796,7 @@
         <w:rPr>
           <w:noProof/>
         </w:rPr>
-        <w:pict w14:anchorId="0BBF3AF7">
+        <w:pict w14:anchorId="0436E8B7">
           <v:rect id="_x0000_i1029" alt="" style="width:451.3pt;height:.05pt;mso-width-percent:0;mso-height-percent:0;mso-width-percent:0;mso-height-percent:0" o:hralign="center" o:hrstd="t" o:hr="t"/>
         </w:pict>
       </w:r>
@@ -10803,7 +10872,7 @@
         <w:rPr>
           <w:noProof/>
         </w:rPr>
-        <w:pict w14:anchorId="03027812">
+        <w:pict w14:anchorId="457CBF35">
           <v:rect id="_x0000_i1028" alt="" style="width:451.3pt;height:.05pt;mso-width-percent:0;mso-height-percent:0;mso-width-percent:0;mso-height-percent:0" o:hralign="center" o:hrstd="t" o:hr="t"/>
         </w:pict>
       </w:r>
@@ -10813,7 +10882,7 @@
         <w:pStyle w:val="Heading2"/>
       </w:pPr>
       <w:bookmarkStart w:id="91" w:name="a.4-kubernetes-deployment"/>
-      <w:bookmarkStart w:id="92" w:name="_Toc229234267"/>
+      <w:bookmarkStart w:id="92" w:name="_Toc229336927"/>
       <w:r>
         <w:t>A.4 Kubernetes Deployment</w:t>
       </w:r>
@@ -10843,7 +10912,7 @@
           <w:noProof/>
         </w:rPr>
         <w:drawing>
-          <wp:inline distT="0" distB="0" distL="0" distR="0" wp14:anchorId="7E18B82B" wp14:editId="6875B845">
+          <wp:inline distT="0" distB="0" distL="0" distR="0" wp14:anchorId="7E18B82B" wp14:editId="29918CB4">
             <wp:extent cx="5943600" cy="621665"/>
             <wp:effectExtent l="0" t="0" r="0" b="0"/>
             <wp:docPr id="1186586320" name="Picture 6"/>
@@ -10890,7 +10959,7 @@
         <w:rPr>
           <w:noProof/>
         </w:rPr>
-        <w:pict w14:anchorId="24EC6901">
+        <w:pict w14:anchorId="5C598A8D">
           <v:rect id="_x0000_i1027" alt="" style="width:451.3pt;height:.05pt;mso-width-percent:0;mso-height-percent:0;mso-width-percent:0;mso-height-percent:0" o:hralign="center" o:hrstd="t" o:hr="t"/>
         </w:pict>
       </w:r>
@@ -10918,7 +10987,7 @@
           <w:noProof/>
         </w:rPr>
         <w:drawing>
-          <wp:inline distT="0" distB="0" distL="0" distR="0" wp14:anchorId="6820596D" wp14:editId="56CDF9CC">
+          <wp:inline distT="0" distB="0" distL="0" distR="0" wp14:anchorId="6820596D" wp14:editId="5E48CA9B">
             <wp:extent cx="5943600" cy="426085"/>
             <wp:effectExtent l="0" t="0" r="0" b="0"/>
             <wp:docPr id="410127504" name="Picture 8"/>
@@ -10986,12 +11055,41 @@
       <w:pPr>
         <w:pStyle w:val="Heading1"/>
       </w:pPr>
-      <w:bookmarkStart w:id="94" w:name="_Toc229234268"/>
+      <w:bookmarkStart w:id="94" w:name="_Toc229336928"/>
+      <w:r>
+        <w:t>Video Link</w:t>
+      </w:r>
+      <w:r>
+        <w:t>:</w:t>
+      </w:r>
+      <w:bookmarkEnd w:id="94"/>
+      <w:r>
+        <w:t xml:space="preserve"> </w:t>
+      </w:r>
+    </w:p>
+    <w:p>
+      <w:pPr>
+        <w:pStyle w:val="BodyText"/>
+      </w:pPr>
+      <w:hyperlink r:id="rId21" w:history="1">
+        <w:r>
+          <w:rPr>
+            <w:rStyle w:val="Hyperlink"/>
+          </w:rPr>
+          <w:t>https://drive.google.com/file/d/1Ut6gkbEGn1KCfbej9-SGe1GyjORQS4rt/view?usp=drive_link</w:t>
+        </w:r>
+      </w:hyperlink>
+    </w:p>
+    <w:p>
+      <w:pPr>
+        <w:pStyle w:val="Heading1"/>
+      </w:pPr>
+      <w:bookmarkStart w:id="95" w:name="_Toc229336929"/>
       <w:r>
         <w:t>References</w:t>
       </w:r>
       <w:bookmarkEnd w:id="93"/>
-      <w:bookmarkEnd w:id="94"/>
+      <w:bookmarkEnd w:id="95"/>
     </w:p>
     <w:p>
       <w:pPr>
@@ -11103,7 +11201,7 @@
         <w:rPr>
           <w:noProof/>
         </w:rPr>
-        <w:pict w14:anchorId="1D9E8E98">
+        <w:pict w14:anchorId="381EC4AC">
           <v:rect id="_x0000_i1026" alt="" style="width:451.3pt;height:.05pt;mso-width-percent:0;mso-height-percent:0;mso-width-percent:0;mso-height-percent:0" o:hralign="center" o:hrstd="t" o:hr="t"/>
         </w:pict>
       </w:r>
@@ -11133,7 +11231,7 @@
         <w:rPr>
           <w:noProof/>
         </w:rPr>
-        <w:pict w14:anchorId="6F0439FB">
+        <w:pict w14:anchorId="3231AC7D">
           <v:rect id="_x0000_i1025" alt="" style="width:451.3pt;height:.05pt;mso-width-percent:0;mso-height-percent:0;mso-width-percent:0;mso-height-percent:0" o:hralign="center" o:hrstd="t" o:hr="t"/>
         </w:pict>
       </w:r>
@@ -11144,9 +11242,9 @@
       </w:pPr>
     </w:p>
     <w:sectPr>
-      <w:footerReference w:type="even" r:id="rId21"/>
-      <w:footerReference w:type="default" r:id="rId22"/>
-      <w:footerReference w:type="first" r:id="rId23"/>
+      <w:footerReference w:type="even" r:id="rId22"/>
+      <w:footerReference w:type="default" r:id="rId23"/>
+      <w:footerReference w:type="first" r:id="rId24"/>
       <w:pgSz w:w="12240" w:h="15840"/>
       <w:pgMar w:top="1440" w:right="1440" w:bottom="1440" w:left="1440" w:header="720" w:footer="720" w:gutter="0"/>
       <w:cols w:space="720"/>
@@ -12695,6 +12793,18 @@
     <w:link w:val="Footer"/>
     <w:rsid w:val="00C26FFB"/>
   </w:style>
+  <w:style w:type="character" w:styleId="UnresolvedMention">
+    <w:name w:val="Unresolved Mention"/>
+    <w:basedOn w:val="DefaultParagraphFont"/>
+    <w:uiPriority w:val="99"/>
+    <w:semiHidden/>
+    <w:unhideWhenUsed/>
+    <w:rsid w:val="007047C1"/>
+    <w:rPr>
+      <w:color w:val="605E5C"/>
+      <w:shd w:val="clear" w:color="auto" w:fill="E1DFDD"/>
+    </w:rPr>
+  </w:style>
 </w:styles>
 </file>
 

</xml_diff>